<commit_message>
fix: integrate with DSH harness runtime (real deployment fixes)
Verified by deploying into a live dsh web profile; three loader failures
surfaced and were fixed:

- cordis.patch.yml: quote the scoped package name (@ is a YAML reserved
  indicator) so the bundle patch parses
- declare inject = ["tools"] so the harness injects the tool registry
- migrate tools to @deepseek-ai/dsh-tools defineTool + JSON-Schema dialect
  (Zod schemas are rejected by the harness tool registry); add dsh.bundle
  declaration and dsh-tools dependency; add prepare/test scripts,
  .gitignore, LICENSE

dsh web now boots with the akn bundle loaded (port 3080).

Co-Authored-By: Claude Opus 4.8 <noreply@anthropic.com>
</commit_message>
<xml_diff>
--- a/docs/架构设计文档.docx
+++ b/docs/架构设计文档.docx
@@ -16233,7 +16233,7 @@
         <w:rPr>
           <w:rFonts w:hint="eastAsia"/>
         </w:rPr>
-        <w:t xml:space="preserve">针对上一阶段已交付并跑通</w:t>
+        <w:t xml:space="preserve">针对已交付源码做代码级差距分析（初版基于</w:t>
       </w:r>
       <w:r>
         <w:t xml:space="preserve"> 14 </w:t>
@@ -16242,27 +16242,81 @@
         <w:rPr>
           <w:rFonts w:hint="eastAsia"/>
         </w:rPr>
-        <w:t xml:space="preserve">项冒烟测试的源码，做代码级差距分析。架构级议题（持久化、验签、向量检索）已列入第</w:t>
-      </w:r>
-      <w:r>
-        <w:t xml:space="preserve"> 13 </w:t>
-      </w:r>
-      <w:r>
-        <w:rPr>
-          <w:rFonts w:hint="eastAsia"/>
-        </w:rPr>
-        <w:t xml:space="preserve">章，本章只列</w:t>
-      </w:r>
-      <w:r>
-        <w:rPr>
-          <w:rFonts w:hint="eastAsia"/>
+        <w:t xml:space="preserve">项冒烟测试；</w:t>
+      </w:r>
+      <w:r>
+        <w:rPr>
           <w:b/>
           <w:bCs/>
         </w:rPr>
-        <w:t xml:space="preserve">新发现</w:t>
-      </w:r>
-      <w:r>
-        <w:t xml:space="preserve">。</w:t>
+        <w:t xml:space="preserve">2026-08-18 </w:t>
+      </w:r>
+      <w:r>
+        <w:rPr>
+          <w:rFonts w:hint="eastAsia"/>
+          <w:b/>
+          <w:bCs/>
+        </w:rPr>
+        <w:t xml:space="preserve">完成第一轮修复</w:t>
+      </w:r>
+      <w:r>
+        <w:rPr>
+          <w:rFonts w:hint="eastAsia"/>
+        </w:rPr>
+        <w:t xml:space="preserve">）。架构级议题（持久化、验签、向量检索）见第</w:t>
+      </w:r>
+      <w:r>
+        <w:t xml:space="preserve"> 13 </w:t>
+      </w:r>
+      <w:r>
+        <w:rPr>
+          <w:rFonts w:hint="eastAsia"/>
+        </w:rPr>
+        <w:t xml:space="preserve">章。</w:t>
+      </w:r>
+      <w:r>
+        <w:t xml:space="preserve"> </w:t>
+      </w:r>
+      <w:r>
+        <w:rPr>
+          <w:rFonts w:hint="eastAsia"/>
+          <w:b/>
+          <w:bCs/>
+        </w:rPr>
+        <w:t xml:space="preserve">状态列</w:t>
+      </w:r>
+      <w:r>
+        <w:rPr>
+          <w:rFonts w:hint="eastAsia"/>
+        </w:rPr>
+        <w:t xml:space="preserve">：✅</w:t>
+      </w:r>
+      <w:r>
+        <w:t xml:space="preserve"> </w:t>
+      </w:r>
+      <w:r>
+        <w:rPr>
+          <w:rFonts w:hint="eastAsia"/>
+        </w:rPr>
+        <w:t xml:space="preserve">已修复（2026-08-18）／⚠️</w:t>
+      </w:r>
+      <w:r>
+        <w:t xml:space="preserve"> </w:t>
+      </w:r>
+      <w:r>
+        <w:rPr>
+          <w:rFonts w:hint="eastAsia"/>
+        </w:rPr>
+        <w:t xml:space="preserve">已加固、待真实挂载确认／⏸</w:t>
+      </w:r>
+      <w:r>
+        <w:t xml:space="preserve"> </w:t>
+      </w:r>
+      <w:r>
+        <w:rPr>
+          <w:rFonts w:hint="eastAsia"/>
+        </w:rPr>
+        <w:t xml:space="preserve">待办。</w:t>
       </w:r>
     </w:p>
     <w:tbl>
@@ -16273,12 +16327,13 @@
         <w:tblLook w:firstRow="1" w:lastRow="0" w:firstColumn="0" w:lastColumn="0" w:noHBand="0" w:noVBand="0" w:val="0020"/>
       </w:tblPr>
       <w:tblGrid>
-        <w:gridCol w:w="1320"/>
-        <w:gridCol w:w="1320"/>
-        <w:gridCol w:w="1320"/>
-        <w:gridCol w:w="1320"/>
-        <w:gridCol w:w="1320"/>
-        <w:gridCol w:w="1320"/>
+        <w:gridCol w:w="1131"/>
+        <w:gridCol w:w="1131"/>
+        <w:gridCol w:w="1131"/>
+        <w:gridCol w:w="1131"/>
+        <w:gridCol w:w="1131"/>
+        <w:gridCol w:w="1131"/>
+        <w:gridCol w:w="1131"/>
       </w:tblGrid>
       <w:tr>
         <w:trPr>
@@ -16365,6 +16420,20 @@
             </w:r>
           </w:p>
         </w:tc>
+        <w:tc>
+          <w:tcPr/>
+          <w:p>
+            <w:pPr>
+              <w:pStyle w:val="Compact"/>
+            </w:pPr>
+            <w:r>
+              <w:rPr>
+                <w:rFonts w:hint="eastAsia"/>
+              </w:rPr>
+              <w:t xml:space="preserve">状态</w:t>
+            </w:r>
+          </w:p>
+        </w:tc>
       </w:tr>
       <w:tr>
         <w:tc>
@@ -16374,7 +16443,7 @@
               <w:pStyle w:val="Compact"/>
             </w:pPr>
             <w:r>
-              <w:t xml:space="preserve">A</w:t>
+              <w:t xml:space="preserve">1</w:t>
             </w:r>
           </w:p>
         </w:tc>
@@ -16388,129 +16457,102 @@
               <w:rPr>
                 <w:rStyle w:val="VerbatimChar"/>
               </w:rPr>
-              <w:t xml:space="preserve">core/storage.ts</w:t>
-            </w:r>
-          </w:p>
-        </w:tc>
-        <w:tc>
-          <w:tcPr/>
-          <w:p>
-            <w:pPr>
-              <w:pStyle w:val="Compact"/>
-            </w:pPr>
-            <w:r>
-              <w:rPr>
-                <w:rStyle w:val="VerbatimChar"/>
-              </w:rPr>
-              <w:t xml:space="preserve">save()</w:t>
+              <w:t xml:space="preserve">core/service.ts</w:t>
             </w:r>
             <w:r>
               <w:t xml:space="preserve"> </w:t>
             </w:r>
             <w:r>
-              <w:rPr>
-                <w:rFonts w:hint="eastAsia"/>
-              </w:rPr>
-              <w:t xml:space="preserve">覆盖同</w:t>
-            </w:r>
-            <w:r>
-              <w:t xml:space="preserve"> id KO </w:t>
-            </w:r>
-            <w:r>
-              <w:rPr>
-                <w:rFonts w:hint="eastAsia"/>
-              </w:rPr>
-              <w:t xml:space="preserve">时，旧</w:t>
-            </w:r>
-            <w:r>
-              <w:t xml:space="preserve"> </w:t>
-            </w:r>
-            <w:r>
-              <w:rPr>
-                <w:rStyle w:val="VerbatimChar"/>
-              </w:rPr>
-              <w:t xml:space="preserve">links.basis</w:t>
-            </w:r>
-            <w:r>
-              <w:t xml:space="preserve"> </w:t>
-            </w:r>
-            <w:r>
-              <w:rPr>
-                <w:rFonts w:hint="eastAsia"/>
-              </w:rPr>
-              <w:t xml:space="preserve">的反向索引条目未清除</w:t>
-            </w:r>
-          </w:p>
-        </w:tc>
-        <w:tc>
-          <w:tcPr/>
-          <w:p>
-            <w:pPr>
-              <w:pStyle w:val="Compact"/>
-            </w:pPr>
-            <w:r>
-              <w:rPr>
-                <w:rFonts w:hint="eastAsia"/>
-              </w:rPr>
-              <w:t xml:space="preserve">级联失效会波及已脱离依赖的</w:t>
-            </w:r>
-            <w:r>
-              <w:t xml:space="preserve"> </w:t>
-            </w:r>
-            <w:r>
-              <w:rPr>
-                <w:rFonts w:hint="eastAsia"/>
-              </w:rPr>
-              <w:t xml:space="preserve">KO（</w:t>
-            </w:r>
+              <w:t xml:space="preserve">publish</w:t>
+            </w:r>
+          </w:p>
+        </w:tc>
+        <w:tc>
+          <w:tcPr/>
+          <w:p>
+            <w:pPr>
+              <w:pStyle w:val="Compact"/>
+            </w:pPr>
             <w:r>
               <w:rPr>
                 <w:rFonts w:hint="eastAsia"/>
                 <w:b/>
                 <w:bCs/>
               </w:rPr>
-              <w:t xml:space="preserve">误伤</w:t>
-            </w:r>
-            <w:r>
-              <w:rPr>
-                <w:rFonts w:hint="eastAsia"/>
-              </w:rPr>
-              <w:t xml:space="preserve">）</w:t>
-            </w:r>
-          </w:p>
-        </w:tc>
-        <w:tc>
-          <w:tcPr/>
-          <w:p>
-            <w:pPr>
-              <w:pStyle w:val="Compact"/>
-            </w:pPr>
-            <w:r>
-              <w:t xml:space="preserve">save </w:t>
-            </w:r>
-            <w:r>
-              <w:rPr>
-                <w:rFonts w:hint="eastAsia"/>
-              </w:rPr>
-              <w:t xml:space="preserve">前先删除该</w:t>
-            </w:r>
-            <w:r>
-              <w:t xml:space="preserve"> id </w:t>
-            </w:r>
-            <w:r>
-              <w:rPr>
-                <w:rFonts w:hint="eastAsia"/>
-              </w:rPr>
-              <w:t xml:space="preserve">既有</w:t>
-            </w:r>
-            <w:r>
-              <w:t xml:space="preserve"> reverseIndex </w:t>
-            </w:r>
-            <w:r>
-              <w:rPr>
-                <w:rFonts w:hint="eastAsia"/>
-              </w:rPr>
-              <w:t xml:space="preserve">条目再重建</w:t>
+              <w:t xml:space="preserve">自证漏洞</w:t>
+            </w:r>
+            <w:r>
+              <w:rPr>
+                <w:rFonts w:hint="eastAsia"/>
+              </w:rPr>
+              <w:t xml:space="preserve">：</w:t>
+            </w:r>
+            <w:r>
+              <w:rPr>
+                <w:rStyle w:val="VerbatimChar"/>
+              </w:rPr>
+              <w:t xml:space="preserve">akn_publish</w:t>
+            </w:r>
+            <w:r>
+              <w:t xml:space="preserve"> </w:t>
+            </w:r>
+            <w:r>
+              <w:rPr>
+                <w:rFonts w:hint="eastAsia"/>
+              </w:rPr>
+              <w:t xml:space="preserve">可带</w:t>
+            </w:r>
+            <w:r>
+              <w:t xml:space="preserve"> </w:t>
+            </w:r>
+            <w:r>
+              <w:rPr>
+                <w:rStyle w:val="VerbatimChar"/>
+              </w:rPr>
+              <w:t xml:space="preserve">status:"verified"</w:t>
+            </w:r>
+            <w:r>
+              <w:t xml:space="preserve"> </w:t>
+            </w:r>
+            <w:r>
+              <w:rPr>
+                <w:rFonts w:hint="eastAsia"/>
+              </w:rPr>
+              <w:t xml:space="preserve">直接自证</w:t>
+            </w:r>
+          </w:p>
+        </w:tc>
+        <w:tc>
+          <w:tcPr/>
+          <w:p>
+            <w:pPr>
+              <w:pStyle w:val="Compact"/>
+            </w:pPr>
+            <w:r>
+              <w:rPr>
+                <w:rFonts w:hint="eastAsia"/>
+              </w:rPr>
+              <w:t xml:space="preserve">信任模型从入口被绕过</w:t>
+            </w:r>
+          </w:p>
+        </w:tc>
+        <w:tc>
+          <w:tcPr/>
+          <w:p>
+            <w:pPr>
+              <w:pStyle w:val="Compact"/>
+            </w:pPr>
+            <w:r>
+              <w:t xml:space="preserve">publish </w:t>
+            </w:r>
+            <w:r>
+              <w:rPr>
+                <w:rFonts w:hint="eastAsia"/>
+              </w:rPr>
+              <w:t xml:space="preserve">状态上限：发布者只能声明</w:t>
+            </w:r>
+            <w:r>
+              <w:t xml:space="preserve"> draft/proposed</w:t>
             </w:r>
           </w:p>
         </w:tc>
@@ -16522,6 +16564,23 @@
             </w:pPr>
             <w:r>
               <w:t xml:space="preserve">P0</w:t>
+            </w:r>
+          </w:p>
+        </w:tc>
+        <w:tc>
+          <w:tcPr/>
+          <w:p>
+            <w:pPr>
+              <w:pStyle w:val="Compact"/>
+            </w:pPr>
+            <w:r>
+              <w:t xml:space="preserve">✅ </w:t>
+            </w:r>
+            <w:r>
+              <w:rPr>
+                <w:rFonts w:hint="eastAsia"/>
+              </w:rPr>
+              <w:t xml:space="preserve">已修复</w:t>
             </w:r>
           </w:p>
         </w:tc>
@@ -16534,7 +16593,7 @@
               <w:pStyle w:val="Compact"/>
             </w:pPr>
             <w:r>
-              <w:t xml:space="preserve">B</w:t>
+              <w:t xml:space="preserve">2</w:t>
             </w:r>
           </w:p>
         </w:tc>
@@ -16548,21 +16607,45 @@
               <w:rPr>
                 <w:rStyle w:val="VerbatimChar"/>
               </w:rPr>
-              <w:t xml:space="preserve">listeners/auto-capture.ts</w:t>
-            </w:r>
-          </w:p>
-        </w:tc>
-        <w:tc>
-          <w:tcPr/>
-          <w:p>
-            <w:pPr>
-              <w:pStyle w:val="Compact"/>
-            </w:pPr>
+              <w:t xml:space="preserve">core/storage.ts</w:t>
+            </w:r>
+            <w:r>
+              <w:t xml:space="preserve"> </w:t>
+            </w:r>
+            <w:r>
+              <w:t xml:space="preserve">save</w:t>
+            </w:r>
+          </w:p>
+        </w:tc>
+        <w:tc>
+          <w:tcPr/>
+          <w:p>
+            <w:pPr>
+              <w:pStyle w:val="Compact"/>
+            </w:pPr>
+            <w:r>
+              <w:rPr>
+                <w:rFonts w:hint="eastAsia"/>
+              </w:rPr>
+              <w:t xml:space="preserve">覆盖同</w:t>
+            </w:r>
+            <w:r>
+              <w:t xml:space="preserve"> id KO </w:t>
+            </w:r>
+            <w:r>
+              <w:rPr>
+                <w:rFonts w:hint="eastAsia"/>
+              </w:rPr>
+              <w:t xml:space="preserve">时旧</w:t>
+            </w:r>
+            <w:r>
+              <w:t xml:space="preserve"> </w:t>
+            </w:r>
             <w:r>
               <w:rPr>
                 <w:rStyle w:val="VerbatimChar"/>
               </w:rPr>
-              <w:t xml:space="preserve">tool/after</w:t>
+              <w:t xml:space="preserve">links.basis</w:t>
             </w:r>
             <w:r>
               <w:t xml:space="preserve"> </w:t>
@@ -16571,71 +16654,41 @@
               <w:rPr>
                 <w:rFonts w:hint="eastAsia"/>
               </w:rPr>
-              <w:t xml:space="preserve">事件</w:t>
-            </w:r>
-            <w:r>
-              <w:t xml:space="preserve"> payload </w:t>
-            </w:r>
-            <w:r>
-              <w:rPr>
-                <w:rFonts w:hint="eastAsia"/>
-              </w:rPr>
-              <w:t xml:space="preserve">形状是假设的（toolName/input/output/durationMs），未对真实</w:t>
-            </w:r>
-            <w:r>
-              <w:t xml:space="preserve"> DSH </w:t>
-            </w:r>
-            <w:r>
-              <w:rPr>
-                <w:rFonts w:hint="eastAsia"/>
-              </w:rPr>
-              <w:t xml:space="preserve">事件验证</w:t>
-            </w:r>
-          </w:p>
-        </w:tc>
-        <w:tc>
-          <w:tcPr/>
-          <w:p>
-            <w:pPr>
-              <w:pStyle w:val="Compact"/>
-            </w:pPr>
-            <w:r>
-              <w:rPr>
-                <w:rFonts w:hint="eastAsia"/>
-              </w:rPr>
-              <w:t xml:space="preserve">集成后可能采不到知识</w:t>
-            </w:r>
-          </w:p>
-        </w:tc>
-        <w:tc>
-          <w:tcPr/>
-          <w:p>
-            <w:pPr>
-              <w:pStyle w:val="Compact"/>
-            </w:pPr>
-            <w:r>
-              <w:rPr>
-                <w:rFonts w:hint="eastAsia"/>
-              </w:rPr>
-              <w:t xml:space="preserve">定义事件契约</w:t>
-            </w:r>
-            <w:r>
-              <w:t xml:space="preserve"> + </w:t>
-            </w:r>
-            <w:r>
-              <w:rPr>
-                <w:rFonts w:hint="eastAsia"/>
-              </w:rPr>
-              <w:t xml:space="preserve">多形态归一化层</w:t>
-            </w:r>
-            <w:r>
-              <w:t xml:space="preserve"> + </w:t>
-            </w:r>
-            <w:r>
-              <w:rPr>
-                <w:rFonts w:hint="eastAsia"/>
-              </w:rPr>
-              <w:t xml:space="preserve">集成测试</w:t>
+              <w:t xml:space="preserve">反向索引条目未清除</w:t>
+            </w:r>
+          </w:p>
+        </w:tc>
+        <w:tc>
+          <w:tcPr/>
+          <w:p>
+            <w:pPr>
+              <w:pStyle w:val="Compact"/>
+            </w:pPr>
+            <w:r>
+              <w:rPr>
+                <w:rFonts w:hint="eastAsia"/>
+              </w:rPr>
+              <w:t xml:space="preserve">级联失效误伤已脱离依赖的</w:t>
+            </w:r>
+            <w:r>
+              <w:t xml:space="preserve"> KO</w:t>
+            </w:r>
+          </w:p>
+        </w:tc>
+        <w:tc>
+          <w:tcPr/>
+          <w:p>
+            <w:pPr>
+              <w:pStyle w:val="Compact"/>
+            </w:pPr>
+            <w:r>
+              <w:t xml:space="preserve">save </w:t>
+            </w:r>
+            <w:r>
+              <w:rPr>
+                <w:rFonts w:hint="eastAsia"/>
+              </w:rPr>
+              <w:t xml:space="preserve">前清除旧边再重建</w:t>
             </w:r>
           </w:p>
         </w:tc>
@@ -16647,6 +16700,23 @@
             </w:pPr>
             <w:r>
               <w:t xml:space="preserve">P0</w:t>
+            </w:r>
+          </w:p>
+        </w:tc>
+        <w:tc>
+          <w:tcPr/>
+          <w:p>
+            <w:pPr>
+              <w:pStyle w:val="Compact"/>
+            </w:pPr>
+            <w:r>
+              <w:t xml:space="preserve">✅ </w:t>
+            </w:r>
+            <w:r>
+              <w:rPr>
+                <w:rFonts w:hint="eastAsia"/>
+              </w:rPr>
+              <w:t xml:space="preserve">已修复</w:t>
             </w:r>
           </w:p>
         </w:tc>
@@ -16659,7 +16729,7 @@
               <w:pStyle w:val="Compact"/>
             </w:pPr>
             <w:r>
-              <w:t xml:space="preserve">C</w:t>
+              <w:t xml:space="preserve">3</w:t>
             </w:r>
           </w:p>
         </w:tc>
@@ -16673,73 +16743,61 @@
               <w:rPr>
                 <w:rStyle w:val="VerbatimChar"/>
               </w:rPr>
-              <w:t xml:space="preserve">index.ts</w:t>
+              <w:t xml:space="preserve">listeners/auto-capture.ts</w:t>
+            </w:r>
+          </w:p>
+        </w:tc>
+        <w:tc>
+          <w:tcPr/>
+          <w:p>
+            <w:pPr>
+              <w:pStyle w:val="Compact"/>
+            </w:pPr>
+            <w:r>
+              <w:rPr>
+                <w:rStyle w:val="VerbatimChar"/>
+              </w:rPr>
+              <w:t xml:space="preserve">tool/after</w:t>
             </w:r>
             <w:r>
               <w:t xml:space="preserve"> </w:t>
             </w:r>
             <w:r>
-              <w:t xml:space="preserve">resolveEnvironment</w:t>
-            </w:r>
-          </w:p>
-        </w:tc>
-        <w:tc>
-          <w:tcPr/>
-          <w:p>
-            <w:pPr>
-              <w:pStyle w:val="Compact"/>
-            </w:pPr>
-            <w:r>
-              <w:rPr>
-                <w:rStyle w:val="VerbatimChar"/>
-              </w:rPr>
-              <w:t xml:space="preserve">ctx.runtime</w:t>
-            </w:r>
-            <w:r>
-              <w:t xml:space="preserve"> </w:t>
-            </w:r>
-            <w:r>
-              <w:rPr>
-                <w:rFonts w:hint="eastAsia"/>
-              </w:rPr>
-              <w:t xml:space="preserve">的字段结构是假设的</w:t>
-            </w:r>
-          </w:p>
-        </w:tc>
-        <w:tc>
-          <w:tcPr/>
-          <w:p>
-            <w:pPr>
-              <w:pStyle w:val="Compact"/>
-            </w:pPr>
-            <w:r>
-              <w:rPr>
-                <w:rFonts w:hint="eastAsia"/>
-              </w:rPr>
-              <w:t xml:space="preserve">环境记录可能缺版本，漂移检测失真</w:t>
-            </w:r>
-          </w:p>
-        </w:tc>
-        <w:tc>
-          <w:tcPr/>
-          <w:p>
-            <w:pPr>
-              <w:pStyle w:val="Compact"/>
-            </w:pPr>
-            <w:r>
-              <w:rPr>
-                <w:rFonts w:hint="eastAsia"/>
-              </w:rPr>
-              <w:t xml:space="preserve">真实挂载后按实际</w:t>
-            </w:r>
-            <w:r>
-              <w:t xml:space="preserve"> runtime </w:t>
-            </w:r>
-            <w:r>
-              <w:rPr>
-                <w:rFonts w:hint="eastAsia"/>
-              </w:rPr>
-              <w:t xml:space="preserve">修正；探测失败明确回退日志</w:t>
+              <w:t xml:space="preserve">payload </w:t>
+            </w:r>
+            <w:r>
+              <w:rPr>
+                <w:rFonts w:hint="eastAsia"/>
+              </w:rPr>
+              <w:t xml:space="preserve">形状假设（toolName/input/output）</w:t>
+            </w:r>
+          </w:p>
+        </w:tc>
+        <w:tc>
+          <w:tcPr/>
+          <w:p>
+            <w:pPr>
+              <w:pStyle w:val="Compact"/>
+            </w:pPr>
+            <w:r>
+              <w:rPr>
+                <w:rFonts w:hint="eastAsia"/>
+              </w:rPr>
+              <w:t xml:space="preserve">集成后可能采不到知识</w:t>
+            </w:r>
+          </w:p>
+        </w:tc>
+        <w:tc>
+          <w:tcPr/>
+          <w:p>
+            <w:pPr>
+              <w:pStyle w:val="Compact"/>
+            </w:pPr>
+            <w:r>
+              <w:rPr>
+                <w:rFonts w:hint="eastAsia"/>
+              </w:rPr>
+              <w:t xml:space="preserve">多字段别名归一化（input/args、output/result、name/tool）</w:t>
             </w:r>
           </w:p>
         </w:tc>
@@ -16751,6 +16809,23 @@
             </w:pPr>
             <w:r>
               <w:t xml:space="preserve">P0</w:t>
+            </w:r>
+          </w:p>
+        </w:tc>
+        <w:tc>
+          <w:tcPr/>
+          <w:p>
+            <w:pPr>
+              <w:pStyle w:val="Compact"/>
+            </w:pPr>
+            <w:r>
+              <w:t xml:space="preserve">⚠️ </w:t>
+            </w:r>
+            <w:r>
+              <w:rPr>
+                <w:rFonts w:hint="eastAsia"/>
+              </w:rPr>
+              <w:t xml:space="preserve">已加固，真实事件待挂载确认</w:t>
             </w:r>
           </w:p>
         </w:tc>
@@ -16763,7 +16838,7 @@
               <w:pStyle w:val="Compact"/>
             </w:pPr>
             <w:r>
-              <w:t xml:space="preserve">D</w:t>
+              <w:t xml:space="preserve">4</w:t>
             </w:r>
           </w:p>
         </w:tc>
@@ -16777,39 +16852,27 @@
               <w:rPr>
                 <w:rStyle w:val="VerbatimChar"/>
               </w:rPr>
-              <w:t xml:space="preserve">bundles/seed.ts</w:t>
-            </w:r>
-          </w:p>
-        </w:tc>
-        <w:tc>
-          <w:tcPr/>
-          <w:p>
-            <w:pPr>
-              <w:pStyle w:val="Compact"/>
-            </w:pPr>
-            <w:r>
-              <w:rPr>
-                <w:rFonts w:hint="eastAsia"/>
-              </w:rPr>
-              <w:t xml:space="preserve">第</w:t>
-            </w:r>
-            <w:r>
-              <w:t xml:space="preserve"> 9 </w:t>
-            </w:r>
-            <w:r>
-              <w:rPr>
-                <w:rFonts w:hint="eastAsia"/>
-              </w:rPr>
-              <w:t xml:space="preserve">章图里的”glob-backslash-ok”refutes</w:t>
+              <w:t xml:space="preserve">index.ts</w:t>
             </w:r>
             <w:r>
               <w:t xml:space="preserve"> </w:t>
             </w:r>
             <w:r>
-              <w:rPr>
-                <w:rFonts w:hint="eastAsia"/>
-              </w:rPr>
-              <w:t xml:space="preserve">目标在代码中不存在，refutes</w:t>
+              <w:t xml:space="preserve">resolveEnvironment</w:t>
+            </w:r>
+          </w:p>
+        </w:tc>
+        <w:tc>
+          <w:tcPr/>
+          <w:p>
+            <w:pPr>
+              <w:pStyle w:val="Compact"/>
+            </w:pPr>
+            <w:r>
+              <w:rPr>
+                <w:rStyle w:val="VerbatimChar"/>
+              </w:rPr>
+              <w:t xml:space="preserve">ctx.runtime</w:t>
             </w:r>
             <w:r>
               <w:t xml:space="preserve"> </w:t>
@@ -16818,73 +16881,63 @@
               <w:rPr>
                 <w:rFonts w:hint="eastAsia"/>
               </w:rPr>
-              <w:t xml:space="preserve">为空数组</w:t>
-            </w:r>
-          </w:p>
-        </w:tc>
-        <w:tc>
-          <w:tcPr/>
-          <w:p>
-            <w:pPr>
-              <w:pStyle w:val="Compact"/>
-            </w:pPr>
-            <w:r>
-              <w:rPr>
-                <w:rFonts w:hint="eastAsia"/>
-              </w:rPr>
-              <w:t xml:space="preserve">文档与实现不一致；级联演示链只覆盖</w:t>
-            </w:r>
-            <w:r>
-              <w:t xml:space="preserve"> basis </w:t>
-            </w:r>
-            <w:r>
-              <w:rPr>
-                <w:rFonts w:hint="eastAsia"/>
-              </w:rPr>
-              <w:t xml:space="preserve">一条边</w:t>
-            </w:r>
-          </w:p>
-        </w:tc>
-        <w:tc>
-          <w:tcPr/>
-          <w:p>
-            <w:pPr>
-              <w:pStyle w:val="Compact"/>
-            </w:pPr>
-            <w:r>
-              <w:rPr>
-                <w:rFonts w:hint="eastAsia"/>
-              </w:rPr>
-              <w:t xml:space="preserve">补齐</w:t>
-            </w:r>
-            <w:r>
-              <w:t xml:space="preserve"> refutes </w:t>
-            </w:r>
-            <w:r>
-              <w:rPr>
-                <w:rFonts w:hint="eastAsia"/>
-              </w:rPr>
-              <w:t xml:space="preserve">目标</w:t>
-            </w:r>
-            <w:r>
-              <w:t xml:space="preserve"> KO </w:t>
-            </w:r>
-            <w:r>
-              <w:rPr>
-                <w:rFonts w:hint="eastAsia"/>
-              </w:rPr>
-              <w:t xml:space="preserve">或修正文档图</w:t>
-            </w:r>
-          </w:p>
-        </w:tc>
-        <w:tc>
-          <w:tcPr/>
-          <w:p>
-            <w:pPr>
-              <w:pStyle w:val="Compact"/>
-            </w:pPr>
-            <w:r>
-              <w:t xml:space="preserve">P1</w:t>
+              <w:t xml:space="preserve">字段结构假设</w:t>
+            </w:r>
+          </w:p>
+        </w:tc>
+        <w:tc>
+          <w:tcPr/>
+          <w:p>
+            <w:pPr>
+              <w:pStyle w:val="Compact"/>
+            </w:pPr>
+            <w:r>
+              <w:rPr>
+                <w:rFonts w:hint="eastAsia"/>
+              </w:rPr>
+              <w:t xml:space="preserve">漂移检测失真</w:t>
+            </w:r>
+          </w:p>
+        </w:tc>
+        <w:tc>
+          <w:tcPr/>
+          <w:p>
+            <w:pPr>
+              <w:pStyle w:val="Compact"/>
+            </w:pPr>
+            <w:r>
+              <w:rPr>
+                <w:rFonts w:hint="eastAsia"/>
+              </w:rPr>
+              <w:t xml:space="preserve">探测失败明确回退日志</w:t>
+            </w:r>
+          </w:p>
+        </w:tc>
+        <w:tc>
+          <w:tcPr/>
+          <w:p>
+            <w:pPr>
+              <w:pStyle w:val="Compact"/>
+            </w:pPr>
+            <w:r>
+              <w:t xml:space="preserve">P0</w:t>
+            </w:r>
+          </w:p>
+        </w:tc>
+        <w:tc>
+          <w:tcPr/>
+          <w:p>
+            <w:pPr>
+              <w:pStyle w:val="Compact"/>
+            </w:pPr>
+            <w:r>
+              <w:t xml:space="preserve">⚠️ </w:t>
+            </w:r>
+            <w:r>
+              <w:rPr>
+                <w:rFonts w:hint="eastAsia"/>
+              </w:rPr>
+              <w:t xml:space="preserve">已加固，真实结构待挂载确认</w:t>
             </w:r>
           </w:p>
         </w:tc>
@@ -16897,81 +16950,53 @@
               <w:pStyle w:val="Compact"/>
             </w:pPr>
             <w:r>
-              <w:t xml:space="preserve">E</w:t>
-            </w:r>
-          </w:p>
-        </w:tc>
-        <w:tc>
-          <w:tcPr/>
-          <w:p>
-            <w:pPr>
-              <w:pStyle w:val="Compact"/>
-            </w:pPr>
-            <w:r>
-              <w:rPr>
-                <w:rFonts w:hint="eastAsia"/>
-              </w:rPr>
-              <w:t xml:space="preserve">测试</w:t>
-            </w:r>
-          </w:p>
-        </w:tc>
-        <w:tc>
-          <w:tcPr/>
-          <w:p>
-            <w:pPr>
-              <w:pStyle w:val="Compact"/>
-            </w:pPr>
-            <w:r>
-              <w:rPr>
-                <w:rFonts w:hint="eastAsia"/>
-              </w:rPr>
-              <w:t xml:space="preserve">仅</w:t>
-            </w:r>
-            <w:r>
-              <w:t xml:space="preserve"> smoke-test.js </w:t>
-            </w:r>
-            <w:r>
-              <w:rPr>
-                <w:rFonts w:hint="eastAsia"/>
-              </w:rPr>
-              <w:t xml:space="preserve">集成冒烟，无单元测试/CI</w:t>
-            </w:r>
-          </w:p>
-        </w:tc>
-        <w:tc>
-          <w:tcPr/>
-          <w:p>
-            <w:pPr>
-              <w:pStyle w:val="Compact"/>
-            </w:pPr>
-            <w:r>
-              <w:rPr>
-                <w:rFonts w:hint="eastAsia"/>
-              </w:rPr>
-              <w:t xml:space="preserve">回归无保障</w:t>
-            </w:r>
-          </w:p>
-        </w:tc>
-        <w:tc>
-          <w:tcPr/>
-          <w:p>
-            <w:pPr>
-              <w:pStyle w:val="Compact"/>
-            </w:pPr>
-            <w:r>
-              <w:rPr>
-                <w:rFonts w:hint="eastAsia"/>
-              </w:rPr>
-              <w:t xml:space="preserve">补</w:t>
-            </w:r>
-            <w:r>
-              <w:t xml:space="preserve"> unit </w:t>
-            </w:r>
-            <w:r>
-              <w:rPr>
-                <w:rFonts w:hint="eastAsia"/>
-              </w:rPr>
-              <w:t xml:space="preserve">tests（service/storage</w:t>
+              <w:t xml:space="preserve">5</w:t>
+            </w:r>
+          </w:p>
+        </w:tc>
+        <w:tc>
+          <w:tcPr/>
+          <w:p>
+            <w:pPr>
+              <w:pStyle w:val="Compact"/>
+            </w:pPr>
+            <w:r>
+              <w:rPr>
+                <w:rStyle w:val="VerbatimChar"/>
+              </w:rPr>
+              <w:t xml:space="preserve">index.ts</w:t>
+            </w:r>
+            <w:r>
+              <w:t xml:space="preserve">/</w:t>
+            </w:r>
+            <w:r>
+              <w:rPr>
+                <w:rStyle w:val="VerbatimChar"/>
+              </w:rPr>
+              <w:t xml:space="preserve">tools</w:t>
+            </w:r>
+          </w:p>
+        </w:tc>
+        <w:tc>
+          <w:tcPr/>
+          <w:p>
+            <w:pPr>
+              <w:pStyle w:val="Compact"/>
+            </w:pPr>
+            <w:r>
+              <w:rPr>
+                <w:rStyle w:val="VerbatimChar"/>
+              </w:rPr>
+              <w:t xml:space="preserve">statusRank</w:t>
+            </w:r>
+            <w:r>
+              <w:t xml:space="preserve">/</w:t>
+            </w:r>
+            <w:r>
+              <w:rPr>
+                <w:rStyle w:val="VerbatimChar"/>
+              </w:rPr>
+              <w:t xml:space="preserve">driftCheckOnSearch</w:t>
             </w:r>
             <w:r>
               <w:t xml:space="preserve"> </w:t>
@@ -16980,10 +17005,38 @@
               <w:rPr>
                 <w:rFonts w:hint="eastAsia"/>
               </w:rPr>
-              <w:t xml:space="preserve">双实现）+</w:t>
-            </w:r>
-            <w:r>
-              <w:t xml:space="preserve"> GitHub Actions</w:t>
+              <w:t xml:space="preserve">配置未接线（死配置）</w:t>
+            </w:r>
+          </w:p>
+        </w:tc>
+        <w:tc>
+          <w:tcPr/>
+          <w:p>
+            <w:pPr>
+              <w:pStyle w:val="Compact"/>
+            </w:pPr>
+            <w:r>
+              <w:rPr>
+                <w:rFonts w:hint="eastAsia"/>
+              </w:rPr>
+              <w:t xml:space="preserve">配置写了等于没写</w:t>
+            </w:r>
+          </w:p>
+        </w:tc>
+        <w:tc>
+          <w:tcPr/>
+          <w:p>
+            <w:pPr>
+              <w:pStyle w:val="Compact"/>
+            </w:pPr>
+            <w:r>
+              <w:t xml:space="preserve">config → registerAknTools → search </w:t>
+            </w:r>
+            <w:r>
+              <w:rPr>
+                <w:rFonts w:hint="eastAsia"/>
+              </w:rPr>
+              <w:t xml:space="preserve">全链路透传</w:t>
             </w:r>
           </w:p>
         </w:tc>
@@ -16995,6 +17048,23 @@
             </w:pPr>
             <w:r>
               <w:t xml:space="preserve">P1</w:t>
+            </w:r>
+          </w:p>
+        </w:tc>
+        <w:tc>
+          <w:tcPr/>
+          <w:p>
+            <w:pPr>
+              <w:pStyle w:val="Compact"/>
+            </w:pPr>
+            <w:r>
+              <w:t xml:space="preserve">✅ </w:t>
+            </w:r>
+            <w:r>
+              <w:rPr>
+                <w:rFonts w:hint="eastAsia"/>
+              </w:rPr>
+              <w:t xml:space="preserve">已修复</w:t>
             </w:r>
           </w:p>
         </w:tc>
@@ -17007,87 +17077,120 @@
               <w:pStyle w:val="Compact"/>
             </w:pPr>
             <w:r>
-              <w:t xml:space="preserve">F</w:t>
-            </w:r>
-          </w:p>
-        </w:tc>
-        <w:tc>
-          <w:tcPr/>
-          <w:p>
-            <w:pPr>
-              <w:pStyle w:val="Compact"/>
-            </w:pPr>
-            <w:r>
-              <w:rPr>
-                <w:rFonts w:hint="eastAsia"/>
-              </w:rPr>
-              <w:t xml:space="preserve">观测性</w:t>
-            </w:r>
-          </w:p>
-        </w:tc>
-        <w:tc>
-          <w:tcPr/>
-          <w:p>
-            <w:pPr>
-              <w:pStyle w:val="Compact"/>
-            </w:pPr>
-            <w:r>
-              <w:rPr>
-                <w:rFonts w:hint="eastAsia"/>
-              </w:rPr>
-              <w:t xml:space="preserve">无统计/健康接口</w:t>
-            </w:r>
-          </w:p>
-        </w:tc>
-        <w:tc>
-          <w:tcPr/>
-          <w:p>
-            <w:pPr>
-              <w:pStyle w:val="Compact"/>
-            </w:pPr>
-            <w:r>
-              <w:rPr>
-                <w:rFonts w:hint="eastAsia"/>
-              </w:rPr>
-              <w:t xml:space="preserve">无法观察</w:t>
-            </w:r>
-            <w:r>
-              <w:t xml:space="preserve"> AKN </w:t>
-            </w:r>
-            <w:r>
-              <w:rPr>
-                <w:rFonts w:hint="eastAsia"/>
-              </w:rPr>
-              <w:t xml:space="preserve">使用量与状态分布</w:t>
-            </w:r>
-          </w:p>
-        </w:tc>
-        <w:tc>
-          <w:tcPr/>
-          <w:p>
-            <w:pPr>
-              <w:pStyle w:val="Compact"/>
-            </w:pPr>
-            <w:r>
-              <w:rPr>
-                <w:rFonts w:hint="eastAsia"/>
-              </w:rPr>
-              <w:t xml:space="preserve">暴露</w:t>
+              <w:t xml:space="preserve">6</w:t>
+            </w:r>
+          </w:p>
+        </w:tc>
+        <w:tc>
+          <w:tcPr/>
+          <w:p>
+            <w:pPr>
+              <w:pStyle w:val="Compact"/>
+            </w:pPr>
+            <w:r>
+              <w:rPr>
+                <w:rStyle w:val="VerbatimChar"/>
+              </w:rPr>
+              <w:t xml:space="preserve">tools/search.tool.ts</w:t>
+            </w:r>
+          </w:p>
+        </w:tc>
+        <w:tc>
+          <w:tcPr/>
+          <w:p>
+            <w:pPr>
+              <w:pStyle w:val="Compact"/>
+            </w:pPr>
+            <w:r>
+              <w:rPr>
+                <w:rStyle w:val="VerbatimChar"/>
+              </w:rPr>
+              <w:t xml:space="preserve">truncated</w:t>
             </w:r>
             <w:r>
               <w:t xml:space="preserve"> </w:t>
             </w:r>
             <w:r>
               <w:rPr>
+                <w:rFonts w:hint="eastAsia"/>
+              </w:rPr>
+              <w:t xml:space="preserve">恒为</w:t>
+            </w:r>
+            <w:r>
+              <w:t xml:space="preserve"> </w:t>
+            </w:r>
+            <w:r>
+              <w:rPr>
+                <w:rFonts w:hint="eastAsia"/>
+              </w:rPr>
+              <w:t xml:space="preserve">false（hits</w:t>
+            </w:r>
+            <w:r>
+              <w:t xml:space="preserve"> </w:t>
+            </w:r>
+            <w:r>
+              <w:rPr>
+                <w:rFonts w:hint="eastAsia"/>
+              </w:rPr>
+              <w:t xml:space="preserve">是</w:t>
+            </w:r>
+            <w:r>
+              <w:t xml:space="preserve"> results </w:t>
+            </w:r>
+            <w:r>
+              <w:rPr>
+                <w:rFonts w:hint="eastAsia"/>
+              </w:rPr>
+              <w:t xml:space="preserve">的</w:t>
+            </w:r>
+            <w:r>
+              <w:t xml:space="preserve"> 1:1 </w:t>
+            </w:r>
+            <w:r>
+              <w:rPr>
+                <w:rFonts w:hint="eastAsia"/>
+              </w:rPr>
+              <w:t xml:space="preserve">map）</w:t>
+            </w:r>
+          </w:p>
+        </w:tc>
+        <w:tc>
+          <w:tcPr/>
+          <w:p>
+            <w:pPr>
+              <w:pStyle w:val="Compact"/>
+            </w:pPr>
+            <w:r>
+              <w:rPr>
+                <w:rFonts w:hint="eastAsia"/>
+              </w:rPr>
+              <w:t xml:space="preserve">返回字段误导</w:t>
+            </w:r>
+            <w:r>
+              <w:t xml:space="preserve"> Agent</w:t>
+            </w:r>
+          </w:p>
+        </w:tc>
+        <w:tc>
+          <w:tcPr/>
+          <w:p>
+            <w:pPr>
+              <w:pStyle w:val="Compact"/>
+            </w:pPr>
+            <w:r>
+              <w:rPr>
+                <w:rFonts w:hint="eastAsia"/>
+              </w:rPr>
+              <w:t xml:space="preserve">新增</w:t>
+            </w:r>
+            <w:r>
+              <w:t xml:space="preserve"> </w:t>
+            </w:r>
+            <w:r>
+              <w:rPr>
                 <w:rStyle w:val="VerbatimChar"/>
               </w:rPr>
-              <w:t xml:space="preserve">ctx.akn.stats()</w:t>
-            </w:r>
-            <w:r>
-              <w:rPr>
-                <w:rFonts w:hint="eastAsia"/>
-              </w:rPr>
-              <w:t xml:space="preserve">（总量/状态分布/验证数）+</w:t>
+              <w:t xml:space="preserve">searchWithMeta()</w:t>
             </w:r>
             <w:r>
               <w:t xml:space="preserve"> </w:t>
@@ -17096,16 +17199,10 @@
               <w:rPr>
                 <w:rFonts w:hint="eastAsia"/>
               </w:rPr>
-              <w:t xml:space="preserve">可选</w:t>
-            </w:r>
-            <w:r>
-              <w:t xml:space="preserve"> admin </w:t>
-            </w:r>
-            <w:r>
-              <w:rPr>
-                <w:rFonts w:hint="eastAsia"/>
-              </w:rPr>
-              <w:t xml:space="preserve">端点</w:t>
+              <w:t xml:space="preserve">返回真实</w:t>
+            </w:r>
+            <w:r>
+              <w:t xml:space="preserve"> truncated</w:t>
             </w:r>
           </w:p>
         </w:tc>
@@ -17117,6 +17214,23 @@
             </w:pPr>
             <w:r>
               <w:t xml:space="preserve">P1</w:t>
+            </w:r>
+          </w:p>
+        </w:tc>
+        <w:tc>
+          <w:tcPr/>
+          <w:p>
+            <w:pPr>
+              <w:pStyle w:val="Compact"/>
+            </w:pPr>
+            <w:r>
+              <w:t xml:space="preserve">✅ </w:t>
+            </w:r>
+            <w:r>
+              <w:rPr>
+                <w:rFonts w:hint="eastAsia"/>
+              </w:rPr>
+              <w:t xml:space="preserve">已修复</w:t>
             </w:r>
           </w:p>
         </w:tc>
@@ -17129,7 +17243,7 @@
               <w:pStyle w:val="Compact"/>
             </w:pPr>
             <w:r>
-              <w:t xml:space="preserve">G</w:t>
+              <w:t xml:space="preserve">7</w:t>
             </w:r>
           </w:p>
         </w:tc>
@@ -17143,64 +17257,21 @@
               <w:rPr>
                 <w:rStyle w:val="VerbatimChar"/>
               </w:rPr>
-              <w:t xml:space="preserve">core/service.ts</w:t>
-            </w:r>
-          </w:p>
-        </w:tc>
-        <w:tc>
-          <w:tcPr/>
-          <w:p>
-            <w:pPr>
-              <w:pStyle w:val="Compact"/>
-            </w:pPr>
-            <w:r>
-              <w:t xml:space="preserve">Zod </w:t>
-            </w:r>
-            <w:r>
-              <w:rPr>
-                <w:rFonts w:hint="eastAsia"/>
-              </w:rPr>
-              <w:t xml:space="preserve">校验失败直接抛原始错误</w:t>
-            </w:r>
-          </w:p>
-        </w:tc>
-        <w:tc>
-          <w:tcPr/>
-          <w:p>
-            <w:pPr>
-              <w:pStyle w:val="Compact"/>
-            </w:pPr>
-            <w:r>
-              <w:t xml:space="preserve">Agent </w:t>
-            </w:r>
-            <w:r>
-              <w:rPr>
-                <w:rFonts w:hint="eastAsia"/>
-              </w:rPr>
-              <w:t xml:space="preserve">收到晦涩</w:t>
-            </w:r>
-            <w:r>
-              <w:t xml:space="preserve"> schema </w:t>
-            </w:r>
-            <w:r>
-              <w:rPr>
-                <w:rFonts w:hint="eastAsia"/>
-              </w:rPr>
-              <w:t xml:space="preserve">报错</w:t>
-            </w:r>
-          </w:p>
-        </w:tc>
-        <w:tc>
-          <w:tcPr/>
-          <w:p>
-            <w:pPr>
-              <w:pStyle w:val="Compact"/>
-            </w:pPr>
-            <w:r>
-              <w:rPr>
-                <w:rFonts w:hint="eastAsia"/>
-              </w:rPr>
-              <w:t xml:space="preserve">包装错误上下文（附带</w:t>
+              <w:t xml:space="preserve">index.ts</w:t>
+            </w:r>
+          </w:p>
+        </w:tc>
+        <w:tc>
+          <w:tcPr/>
+          <w:p>
+            <w:pPr>
+              <w:pStyle w:val="Compact"/>
+            </w:pPr>
+            <w:r>
+              <w:rPr>
+                <w:rStyle w:val="VerbatimChar"/>
+              </w:rPr>
+              <w:t xml:space="preserve">ctx.provide("akn", service)</w:t>
             </w:r>
             <w:r>
               <w:t xml:space="preserve"> </w:t>
@@ -17209,7 +17280,62 @@
               <w:rPr>
                 <w:rFonts w:hint="eastAsia"/>
               </w:rPr>
-              <w:t xml:space="preserve">title/body.type）</w:t>
+              <w:t xml:space="preserve">签名未验证</w:t>
+            </w:r>
+          </w:p>
+        </w:tc>
+        <w:tc>
+          <w:tcPr/>
+          <w:p>
+            <w:pPr>
+              <w:pStyle w:val="Compact"/>
+            </w:pPr>
+            <w:r>
+              <w:rPr>
+                <w:rFonts w:hint="eastAsia"/>
+              </w:rPr>
+              <w:t xml:space="preserve">依赖</w:t>
+            </w:r>
+            <w:r>
+              <w:t xml:space="preserve"> cordis provide </w:t>
+            </w:r>
+            <w:r>
+              <w:rPr>
+                <w:rFonts w:hint="eastAsia"/>
+              </w:rPr>
+              <w:t xml:space="preserve">语义</w:t>
+            </w:r>
+          </w:p>
+        </w:tc>
+        <w:tc>
+          <w:tcPr/>
+          <w:p>
+            <w:pPr>
+              <w:pStyle w:val="Compact"/>
+            </w:pPr>
+            <w:r>
+              <w:rPr>
+                <w:rFonts w:hint="eastAsia"/>
+              </w:rPr>
+              <w:t xml:space="preserve">保留</w:t>
+            </w:r>
+            <w:r>
+              <w:t xml:space="preserve"> </w:t>
+            </w:r>
+            <w:r>
+              <w:rPr>
+                <w:rStyle w:val="VerbatimChar"/>
+              </w:rPr>
+              <w:t xml:space="preserve">ctx.akn = service</w:t>
+            </w:r>
+            <w:r>
+              <w:t xml:space="preserve"> </w:t>
+            </w:r>
+            <w:r>
+              <w:rPr>
+                <w:rFonts w:hint="eastAsia"/>
+              </w:rPr>
+              <w:t xml:space="preserve">直挂兜底</w:t>
             </w:r>
           </w:p>
         </w:tc>
@@ -17221,6 +17347,23 @@
             </w:pPr>
             <w:r>
               <w:t xml:space="preserve">P1</w:t>
+            </w:r>
+          </w:p>
+        </w:tc>
+        <w:tc>
+          <w:tcPr/>
+          <w:p>
+            <w:pPr>
+              <w:pStyle w:val="Compact"/>
+            </w:pPr>
+            <w:r>
+              <w:t xml:space="preserve">⏸ </w:t>
+            </w:r>
+            <w:r>
+              <w:rPr>
+                <w:rFonts w:hint="eastAsia"/>
+              </w:rPr>
+              <w:t xml:space="preserve">双保险保留，待挂载确认</w:t>
             </w:r>
           </w:p>
         </w:tc>
@@ -17233,7 +17376,7 @@
               <w:pStyle w:val="Compact"/>
             </w:pPr>
             <w:r>
-              <w:t xml:space="preserve">H</w:t>
+              <w:t xml:space="preserve">8</w:t>
             </w:r>
           </w:p>
         </w:tc>
@@ -17247,73 +17390,67 @@
               <w:rPr>
                 <w:rStyle w:val="VerbatimChar"/>
               </w:rPr>
-              <w:t xml:space="preserve">core/service.ts</w:t>
+              <w:t xml:space="preserve">core/storage.ts</w:t>
+            </w:r>
+          </w:p>
+        </w:tc>
+        <w:tc>
+          <w:tcPr/>
+          <w:p>
+            <w:pPr>
+              <w:pStyle w:val="Compact"/>
+            </w:pPr>
+            <w:r>
+              <w:rPr>
+                <w:rStyle w:val="VerbatimChar"/>
+              </w:rPr>
+              <w:t xml:space="preserve">isKnownStatus</w:t>
+            </w:r>
+            <w:r>
+              <w:t xml:space="preserve">/</w:t>
+            </w:r>
+            <w:r>
+              <w:rPr>
+                <w:rStyle w:val="VerbatimChar"/>
+              </w:rPr>
+              <w:t xml:space="preserve">isBodyType</w:t>
             </w:r>
             <w:r>
               <w:t xml:space="preserve"> </w:t>
             </w:r>
             <w:r>
-              <w:t xml:space="preserve">search</w:t>
-            </w:r>
-          </w:p>
-        </w:tc>
-        <w:tc>
-          <w:tcPr/>
-          <w:p>
-            <w:pPr>
-              <w:pStyle w:val="Compact"/>
-            </w:pPr>
-            <w:r>
-              <w:rPr>
-                <w:rFonts w:hint="eastAsia"/>
-              </w:rPr>
-              <w:t xml:space="preserve">同</w:t>
-            </w:r>
-            <w:r>
-              <w:t xml:space="preserve"> rank </w:t>
-            </w:r>
-            <w:r>
-              <w:rPr>
-                <w:rFonts w:hint="eastAsia"/>
-              </w:rPr>
-              <w:t xml:space="preserve">内无次级排序</w:t>
-            </w:r>
-          </w:p>
-        </w:tc>
-        <w:tc>
-          <w:tcPr/>
-          <w:p>
-            <w:pPr>
-              <w:pStyle w:val="Compact"/>
-            </w:pPr>
-            <w:r>
-              <w:rPr>
-                <w:rFonts w:hint="eastAsia"/>
-              </w:rPr>
-              <w:t xml:space="preserve">同状态结果顺序不稳定</w:t>
-            </w:r>
-          </w:p>
-        </w:tc>
-        <w:tc>
-          <w:tcPr/>
-          <w:p>
-            <w:pPr>
-              <w:pStyle w:val="Compact"/>
-            </w:pPr>
-            <w:r>
-              <w:rPr>
-                <w:rFonts w:hint="eastAsia"/>
-              </w:rPr>
-              <w:t xml:space="preserve">次级键</w:t>
-            </w:r>
-            <w:r>
-              <w:t xml:space="preserve"> createdAt </w:t>
-            </w:r>
-            <w:r>
-              <w:rPr>
-                <w:rFonts w:hint="eastAsia"/>
-              </w:rPr>
-              <w:t xml:space="preserve">降序</w:t>
+              <w:rPr>
+                <w:rFonts w:hint="eastAsia"/>
+              </w:rPr>
+              <w:t xml:space="preserve">死代码</w:t>
+            </w:r>
+          </w:p>
+        </w:tc>
+        <w:tc>
+          <w:tcPr/>
+          <w:p>
+            <w:pPr>
+              <w:pStyle w:val="Compact"/>
+            </w:pPr>
+            <w:r>
+              <w:rPr>
+                <w:rFonts w:hint="eastAsia"/>
+              </w:rPr>
+              <w:t xml:space="preserve">噪音</w:t>
+            </w:r>
+          </w:p>
+        </w:tc>
+        <w:tc>
+          <w:tcPr/>
+          <w:p>
+            <w:pPr>
+              <w:pStyle w:val="Compact"/>
+            </w:pPr>
+            <w:r>
+              <w:rPr>
+                <w:rFonts w:hint="eastAsia"/>
+              </w:rPr>
+              <w:t xml:space="preserve">删除</w:t>
             </w:r>
           </w:p>
         </w:tc>
@@ -17325,6 +17462,23 @@
             </w:pPr>
             <w:r>
               <w:t xml:space="preserve">P2</w:t>
+            </w:r>
+          </w:p>
+        </w:tc>
+        <w:tc>
+          <w:tcPr/>
+          <w:p>
+            <w:pPr>
+              <w:pStyle w:val="Compact"/>
+            </w:pPr>
+            <w:r>
+              <w:t xml:space="preserve">✅ </w:t>
+            </w:r>
+            <w:r>
+              <w:rPr>
+                <w:rFonts w:hint="eastAsia"/>
+              </w:rPr>
+              <w:t xml:space="preserve">已修复</w:t>
             </w:r>
           </w:p>
         </w:tc>
@@ -17337,7 +17491,7 @@
               <w:pStyle w:val="Compact"/>
             </w:pPr>
             <w:r>
-              <w:t xml:space="preserve">I</w:t>
+              <w:t xml:space="preserve">9</w:t>
             </w:r>
           </w:p>
         </w:tc>
@@ -17357,61 +17511,61 @@
               <w:t xml:space="preserve"> </w:t>
             </w:r>
             <w:r>
-              <w:t xml:space="preserve">canonicalJson</w:t>
-            </w:r>
-          </w:p>
-        </w:tc>
-        <w:tc>
-          <w:tcPr/>
-          <w:p>
-            <w:pPr>
-              <w:pStyle w:val="Compact"/>
-            </w:pPr>
-            <w:r>
-              <w:t xml:space="preserve">undefined </w:t>
-            </w:r>
-            <w:r>
-              <w:rPr>
-                <w:rFonts w:hint="eastAsia"/>
-              </w:rPr>
-              <w:t xml:space="preserve">字段被丢弃，语义未文档化</w:t>
-            </w:r>
-          </w:p>
-        </w:tc>
-        <w:tc>
-          <w:tcPr/>
-          <w:p>
-            <w:pPr>
-              <w:pStyle w:val="Compact"/>
-            </w:pPr>
-            <w:r>
-              <w:rPr>
-                <w:rFonts w:hint="eastAsia"/>
-              </w:rPr>
-              <w:t xml:space="preserve">极端输入下</w:t>
-            </w:r>
-            <w:r>
-              <w:t xml:space="preserve"> hash </w:t>
-            </w:r>
-            <w:r>
-              <w:rPr>
-                <w:rFonts w:hint="eastAsia"/>
-              </w:rPr>
-              <w:t xml:space="preserve">语义不透明</w:t>
-            </w:r>
-          </w:p>
-        </w:tc>
-        <w:tc>
-          <w:tcPr/>
-          <w:p>
-            <w:pPr>
-              <w:pStyle w:val="Compact"/>
-            </w:pPr>
-            <w:r>
-              <w:rPr>
-                <w:rFonts w:hint="eastAsia"/>
-              </w:rPr>
-              <w:t xml:space="preserve">文档化该约定</w:t>
+              <w:t xml:space="preserve">search</w:t>
+            </w:r>
+          </w:p>
+        </w:tc>
+        <w:tc>
+          <w:tcPr/>
+          <w:p>
+            <w:pPr>
+              <w:pStyle w:val="Compact"/>
+            </w:pPr>
+            <w:r>
+              <w:rPr>
+                <w:rFonts w:hint="eastAsia"/>
+              </w:rPr>
+              <w:t xml:space="preserve">同</w:t>
+            </w:r>
+            <w:r>
+              <w:t xml:space="preserve"> rank </w:t>
+            </w:r>
+            <w:r>
+              <w:rPr>
+                <w:rFonts w:hint="eastAsia"/>
+              </w:rPr>
+              <w:t xml:space="preserve">无次级排序</w:t>
+            </w:r>
+          </w:p>
+        </w:tc>
+        <w:tc>
+          <w:tcPr/>
+          <w:p>
+            <w:pPr>
+              <w:pStyle w:val="Compact"/>
+            </w:pPr>
+            <w:r>
+              <w:rPr>
+                <w:rFonts w:hint="eastAsia"/>
+              </w:rPr>
+              <w:t xml:space="preserve">顺序不稳定</w:t>
+            </w:r>
+          </w:p>
+        </w:tc>
+        <w:tc>
+          <w:tcPr/>
+          <w:p>
+            <w:pPr>
+              <w:pStyle w:val="Compact"/>
+            </w:pPr>
+            <w:r>
+              <w:t xml:space="preserve">createdAt </w:t>
+            </w:r>
+            <w:r>
+              <w:rPr>
+                <w:rFonts w:hint="eastAsia"/>
+              </w:rPr>
+              <w:t xml:space="preserve">降序次级键</w:t>
             </w:r>
           </w:p>
         </w:tc>
@@ -17423,6 +17577,23 @@
             </w:pPr>
             <w:r>
               <w:t xml:space="preserve">P2</w:t>
+            </w:r>
+          </w:p>
+        </w:tc>
+        <w:tc>
+          <w:tcPr/>
+          <w:p>
+            <w:pPr>
+              <w:pStyle w:val="Compact"/>
+            </w:pPr>
+            <w:r>
+              <w:t xml:space="preserve">✅ </w:t>
+            </w:r>
+            <w:r>
+              <w:rPr>
+                <w:rFonts w:hint="eastAsia"/>
+              </w:rPr>
+              <w:t xml:space="preserve">已修复</w:t>
             </w:r>
           </w:p>
         </w:tc>
@@ -17435,7 +17606,7 @@
               <w:pStyle w:val="Compact"/>
             </w:pPr>
             <w:r>
-              <w:t xml:space="preserve">J</w:t>
+              <w:t xml:space="preserve">10</w:t>
             </w:r>
           </w:p>
         </w:tc>
@@ -17449,33 +17620,566 @@
               <w:rPr>
                 <w:rStyle w:val="VerbatimChar"/>
               </w:rPr>
+              <w:t xml:space="preserve">core/service.ts</w:t>
+            </w:r>
+          </w:p>
+        </w:tc>
+        <w:tc>
+          <w:tcPr/>
+          <w:p>
+            <w:pPr>
+              <w:pStyle w:val="Compact"/>
+            </w:pPr>
+            <w:r>
+              <w:t xml:space="preserve">Zod </w:t>
+            </w:r>
+            <w:r>
+              <w:rPr>
+                <w:rFonts w:hint="eastAsia"/>
+              </w:rPr>
+              <w:t xml:space="preserve">校验失败裸抛原始错误</w:t>
+            </w:r>
+          </w:p>
+        </w:tc>
+        <w:tc>
+          <w:tcPr/>
+          <w:p>
+            <w:pPr>
+              <w:pStyle w:val="Compact"/>
+            </w:pPr>
+            <w:r>
+              <w:t xml:space="preserve">Agent </w:t>
+            </w:r>
+            <w:r>
+              <w:rPr>
+                <w:rFonts w:hint="eastAsia"/>
+              </w:rPr>
+              <w:t xml:space="preserve">收到晦涩报错</w:t>
+            </w:r>
+          </w:p>
+        </w:tc>
+        <w:tc>
+          <w:tcPr/>
+          <w:p>
+            <w:pPr>
+              <w:pStyle w:val="Compact"/>
+            </w:pPr>
+            <w:r>
+              <w:rPr>
+                <w:rFonts w:hint="eastAsia"/>
+              </w:rPr>
+              <w:t xml:space="preserve">包装错误上下文</w:t>
+            </w:r>
+          </w:p>
+        </w:tc>
+        <w:tc>
+          <w:tcPr/>
+          <w:p>
+            <w:pPr>
+              <w:pStyle w:val="Compact"/>
+            </w:pPr>
+            <w:r>
+              <w:t xml:space="preserve">P1</w:t>
+            </w:r>
+          </w:p>
+        </w:tc>
+        <w:tc>
+          <w:tcPr/>
+          <w:p>
+            <w:pPr>
+              <w:pStyle w:val="Compact"/>
+            </w:pPr>
+            <w:r>
+              <w:t xml:space="preserve">⏸ </w:t>
+            </w:r>
+            <w:r>
+              <w:rPr>
+                <w:rFonts w:hint="eastAsia"/>
+              </w:rPr>
+              <w:t xml:space="preserve">待办</w:t>
+            </w:r>
+          </w:p>
+        </w:tc>
+      </w:tr>
+      <w:tr>
+        <w:tc>
+          <w:tcPr/>
+          <w:p>
+            <w:pPr>
+              <w:pStyle w:val="Compact"/>
+            </w:pPr>
+            <w:r>
+              <w:t xml:space="preserve">11</w:t>
+            </w:r>
+          </w:p>
+        </w:tc>
+        <w:tc>
+          <w:tcPr/>
+          <w:p>
+            <w:pPr>
+              <w:pStyle w:val="Compact"/>
+            </w:pPr>
+            <w:r>
+              <w:rPr>
+                <w:rFonts w:hint="eastAsia"/>
+              </w:rPr>
+              <w:t xml:space="preserve">观测性</w:t>
+            </w:r>
+          </w:p>
+        </w:tc>
+        <w:tc>
+          <w:tcPr/>
+          <w:p>
+            <w:pPr>
+              <w:pStyle w:val="Compact"/>
+            </w:pPr>
+            <w:r>
+              <w:rPr>
+                <w:rFonts w:hint="eastAsia"/>
+              </w:rPr>
+              <w:t xml:space="preserve">无统计/健康接口</w:t>
+            </w:r>
+          </w:p>
+        </w:tc>
+        <w:tc>
+          <w:tcPr/>
+          <w:p>
+            <w:pPr>
+              <w:pStyle w:val="Compact"/>
+            </w:pPr>
+            <w:r>
+              <w:rPr>
+                <w:rFonts w:hint="eastAsia"/>
+              </w:rPr>
+              <w:t xml:space="preserve">无法观察使用量</w:t>
+            </w:r>
+          </w:p>
+        </w:tc>
+        <w:tc>
+          <w:tcPr/>
+          <w:p>
+            <w:pPr>
+              <w:pStyle w:val="Compact"/>
+            </w:pPr>
+            <w:r>
+              <w:rPr>
+                <w:rStyle w:val="VerbatimChar"/>
+              </w:rPr>
+              <w:t xml:space="preserve">ctx.akn.stats()</w:t>
+            </w:r>
+          </w:p>
+        </w:tc>
+        <w:tc>
+          <w:tcPr/>
+          <w:p>
+            <w:pPr>
+              <w:pStyle w:val="Compact"/>
+            </w:pPr>
+            <w:r>
+              <w:t xml:space="preserve">P1</w:t>
+            </w:r>
+          </w:p>
+        </w:tc>
+        <w:tc>
+          <w:tcPr/>
+          <w:p>
+            <w:pPr>
+              <w:pStyle w:val="Compact"/>
+            </w:pPr>
+            <w:r>
+              <w:t xml:space="preserve">⏸ </w:t>
+            </w:r>
+            <w:r>
+              <w:rPr>
+                <w:rFonts w:hint="eastAsia"/>
+              </w:rPr>
+              <w:t xml:space="preserve">待办</w:t>
+            </w:r>
+          </w:p>
+        </w:tc>
+      </w:tr>
+      <w:tr>
+        <w:tc>
+          <w:tcPr/>
+          <w:p>
+            <w:pPr>
+              <w:pStyle w:val="Compact"/>
+            </w:pPr>
+            <w:r>
+              <w:t xml:space="preserve">12</w:t>
+            </w:r>
+          </w:p>
+        </w:tc>
+        <w:tc>
+          <w:tcPr/>
+          <w:p>
+            <w:pPr>
+              <w:pStyle w:val="Compact"/>
+            </w:pPr>
+            <w:r>
+              <w:rPr>
+                <w:rStyle w:val="VerbatimChar"/>
+              </w:rPr>
+              <w:t xml:space="preserve">bundles/seed.ts</w:t>
+            </w:r>
+          </w:p>
+        </w:tc>
+        <w:tc>
+          <w:tcPr/>
+          <w:p>
+            <w:pPr>
+              <w:pStyle w:val="Compact"/>
+            </w:pPr>
+            <w:r>
+              <w:t xml:space="preserve">refutes </w:t>
+            </w:r>
+            <w:r>
+              <w:rPr>
+                <w:rFonts w:hint="eastAsia"/>
+              </w:rPr>
+              <w:t xml:space="preserve">目标在代码中不存在</w:t>
+            </w:r>
+          </w:p>
+        </w:tc>
+        <w:tc>
+          <w:tcPr/>
+          <w:p>
+            <w:pPr>
+              <w:pStyle w:val="Compact"/>
+            </w:pPr>
+            <w:r>
+              <w:rPr>
+                <w:rFonts w:hint="eastAsia"/>
+              </w:rPr>
+              <w:t xml:space="preserve">文档/实现不一致</w:t>
+            </w:r>
+          </w:p>
+        </w:tc>
+        <w:tc>
+          <w:tcPr/>
+          <w:p>
+            <w:pPr>
+              <w:pStyle w:val="Compact"/>
+            </w:pPr>
+            <w:r>
+              <w:rPr>
+                <w:rFonts w:hint="eastAsia"/>
+              </w:rPr>
+              <w:t xml:space="preserve">补齐或改文档图</w:t>
+            </w:r>
+          </w:p>
+        </w:tc>
+        <w:tc>
+          <w:tcPr/>
+          <w:p>
+            <w:pPr>
+              <w:pStyle w:val="Compact"/>
+            </w:pPr>
+            <w:r>
+              <w:t xml:space="preserve">P1</w:t>
+            </w:r>
+          </w:p>
+        </w:tc>
+        <w:tc>
+          <w:tcPr/>
+          <w:p>
+            <w:pPr>
+              <w:pStyle w:val="Compact"/>
+            </w:pPr>
+            <w:r>
+              <w:t xml:space="preserve">⏸ </w:t>
+            </w:r>
+            <w:r>
+              <w:rPr>
+                <w:rFonts w:hint="eastAsia"/>
+              </w:rPr>
+              <w:t xml:space="preserve">待办</w:t>
+            </w:r>
+          </w:p>
+        </w:tc>
+      </w:tr>
+      <w:tr>
+        <w:tc>
+          <w:tcPr/>
+          <w:p>
+            <w:pPr>
+              <w:pStyle w:val="Compact"/>
+            </w:pPr>
+            <w:r>
+              <w:t xml:space="preserve">13</w:t>
+            </w:r>
+          </w:p>
+        </w:tc>
+        <w:tc>
+          <w:tcPr/>
+          <w:p>
+            <w:pPr>
+              <w:pStyle w:val="Compact"/>
+            </w:pPr>
+            <w:r>
+              <w:rPr>
+                <w:rFonts w:hint="eastAsia"/>
+              </w:rPr>
+              <w:t xml:space="preserve">测试</w:t>
+            </w:r>
+          </w:p>
+        </w:tc>
+        <w:tc>
+          <w:tcPr/>
+          <w:p>
+            <w:pPr>
+              <w:pStyle w:val="Compact"/>
+            </w:pPr>
+            <w:r>
+              <w:rPr>
+                <w:rFonts w:hint="eastAsia"/>
+              </w:rPr>
+              <w:t xml:space="preserve">仅</w:t>
+            </w:r>
+            <w:r>
+              <w:t xml:space="preserve"> </w:t>
+            </w:r>
+            <w:r>
+              <w:rPr>
+                <w:rFonts w:hint="eastAsia"/>
+              </w:rPr>
+              <w:t xml:space="preserve">smoke-test，无单测/CI</w:t>
+            </w:r>
+          </w:p>
+        </w:tc>
+        <w:tc>
+          <w:tcPr/>
+          <w:p>
+            <w:pPr>
+              <w:pStyle w:val="Compact"/>
+            </w:pPr>
+            <w:r>
+              <w:rPr>
+                <w:rFonts w:hint="eastAsia"/>
+              </w:rPr>
+              <w:t xml:space="preserve">回归无保障</w:t>
+            </w:r>
+          </w:p>
+        </w:tc>
+        <w:tc>
+          <w:tcPr/>
+          <w:p>
+            <w:pPr>
+              <w:pStyle w:val="Compact"/>
+            </w:pPr>
+            <w:r>
+              <w:rPr>
+                <w:rFonts w:hint="eastAsia"/>
+              </w:rPr>
+              <w:t xml:space="preserve">单测</w:t>
+            </w:r>
+            <w:r>
+              <w:t xml:space="preserve"> + GitHub Actions</w:t>
+            </w:r>
+          </w:p>
+        </w:tc>
+        <w:tc>
+          <w:tcPr/>
+          <w:p>
+            <w:pPr>
+              <w:pStyle w:val="Compact"/>
+            </w:pPr>
+            <w:r>
+              <w:t xml:space="preserve">P1</w:t>
+            </w:r>
+          </w:p>
+        </w:tc>
+        <w:tc>
+          <w:tcPr/>
+          <w:p>
+            <w:pPr>
+              <w:pStyle w:val="Compact"/>
+            </w:pPr>
+            <w:r>
+              <w:t xml:space="preserve">⚠️ </w:t>
+            </w:r>
+            <w:r>
+              <w:rPr>
+                <w:rFonts w:hint="eastAsia"/>
+              </w:rPr>
+              <w:t xml:space="preserve">部分（smoke</w:t>
+            </w:r>
+            <w:r>
+              <w:t xml:space="preserve"> </w:t>
+            </w:r>
+            <w:r>
+              <w:rPr>
+                <w:rFonts w:hint="eastAsia"/>
+              </w:rPr>
+              <w:t xml:space="preserve">扩至</w:t>
+            </w:r>
+            <w:r>
+              <w:t xml:space="preserve"> 20 </w:t>
+            </w:r>
+            <w:r>
+              <w:rPr>
+                <w:rFonts w:hint="eastAsia"/>
+              </w:rPr>
+              <w:t xml:space="preserve">项，无</w:t>
+            </w:r>
+            <w:r>
+              <w:t xml:space="preserve"> </w:t>
+            </w:r>
+            <w:r>
+              <w:rPr>
+                <w:rFonts w:hint="eastAsia"/>
+              </w:rPr>
+              <w:t xml:space="preserve">CI）</w:t>
+            </w:r>
+          </w:p>
+        </w:tc>
+      </w:tr>
+      <w:tr>
+        <w:tc>
+          <w:tcPr/>
+          <w:p>
+            <w:pPr>
+              <w:pStyle w:val="Compact"/>
+            </w:pPr>
+            <w:r>
+              <w:t xml:space="preserve">14</w:t>
+            </w:r>
+          </w:p>
+        </w:tc>
+        <w:tc>
+          <w:tcPr/>
+          <w:p>
+            <w:pPr>
+              <w:pStyle w:val="Compact"/>
+            </w:pPr>
+            <w:r>
+              <w:rPr>
+                <w:rStyle w:val="VerbatimChar"/>
+              </w:rPr>
+              <w:t xml:space="preserve">core/service.ts</w:t>
+            </w:r>
+            <w:r>
+              <w:t xml:space="preserve"> </w:t>
+            </w:r>
+            <w:r>
+              <w:t xml:space="preserve">canonicalJson</w:t>
+            </w:r>
+          </w:p>
+        </w:tc>
+        <w:tc>
+          <w:tcPr/>
+          <w:p>
+            <w:pPr>
+              <w:pStyle w:val="Compact"/>
+            </w:pPr>
+            <w:r>
+              <w:t xml:space="preserve">undefined </w:t>
+            </w:r>
+            <w:r>
+              <w:rPr>
+                <w:rFonts w:hint="eastAsia"/>
+              </w:rPr>
+              <w:t xml:space="preserve">字段丢弃语义未文档化</w:t>
+            </w:r>
+          </w:p>
+        </w:tc>
+        <w:tc>
+          <w:tcPr/>
+          <w:p>
+            <w:pPr>
+              <w:pStyle w:val="Compact"/>
+            </w:pPr>
+            <w:r>
+              <w:t xml:space="preserve">hash </w:t>
+            </w:r>
+            <w:r>
+              <w:rPr>
+                <w:rFonts w:hint="eastAsia"/>
+              </w:rPr>
+              <w:t xml:space="preserve">语义不透明</w:t>
+            </w:r>
+          </w:p>
+        </w:tc>
+        <w:tc>
+          <w:tcPr/>
+          <w:p>
+            <w:pPr>
+              <w:pStyle w:val="Compact"/>
+            </w:pPr>
+            <w:r>
+              <w:rPr>
+                <w:rFonts w:hint="eastAsia"/>
+              </w:rPr>
+              <w:t xml:space="preserve">文档化</w:t>
+            </w:r>
+          </w:p>
+        </w:tc>
+        <w:tc>
+          <w:tcPr/>
+          <w:p>
+            <w:pPr>
+              <w:pStyle w:val="Compact"/>
+            </w:pPr>
+            <w:r>
+              <w:t xml:space="preserve">P2</w:t>
+            </w:r>
+          </w:p>
+        </w:tc>
+        <w:tc>
+          <w:tcPr/>
+          <w:p>
+            <w:pPr>
+              <w:pStyle w:val="Compact"/>
+            </w:pPr>
+            <w:r>
+              <w:t xml:space="preserve">⏸ </w:t>
+            </w:r>
+            <w:r>
+              <w:rPr>
+                <w:rFonts w:hint="eastAsia"/>
+              </w:rPr>
+              <w:t xml:space="preserve">待办</w:t>
+            </w:r>
+          </w:p>
+        </w:tc>
+      </w:tr>
+      <w:tr>
+        <w:tc>
+          <w:tcPr/>
+          <w:p>
+            <w:pPr>
+              <w:pStyle w:val="Compact"/>
+            </w:pPr>
+            <w:r>
+              <w:t xml:space="preserve">15</w:t>
+            </w:r>
+          </w:p>
+        </w:tc>
+        <w:tc>
+          <w:tcPr/>
+          <w:p>
+            <w:pPr>
+              <w:pStyle w:val="Compact"/>
+            </w:pPr>
+            <w:r>
+              <w:rPr>
+                <w:rStyle w:val="VerbatimChar"/>
+              </w:rPr>
               <w:t xml:space="preserve">index.ts</w:t>
             </w:r>
-            <w:r>
-              <w:t xml:space="preserve"> </w:t>
-            </w:r>
-            <w:r>
-              <w:t xml:space="preserve">/ </w:t>
-            </w:r>
-            <w:r>
-              <w:rPr>
-                <w:rFonts w:hint="eastAsia"/>
-              </w:rPr>
-              <w:t xml:space="preserve">装配</w:t>
-            </w:r>
-          </w:p>
-        </w:tc>
-        <w:tc>
-          <w:tcPr/>
-          <w:p>
-            <w:pPr>
-              <w:pStyle w:val="Compact"/>
-            </w:pPr>
-            <w:r>
-              <w:rPr>
-                <w:rFonts w:hint="eastAsia"/>
-              </w:rPr>
-              <w:t xml:space="preserve">系统提示注入未实现，仅注册工具</w:t>
+          </w:p>
+        </w:tc>
+        <w:tc>
+          <w:tcPr/>
+          <w:p>
+            <w:pPr>
+              <w:pStyle w:val="Compact"/>
+            </w:pPr>
+            <w:r>
+              <w:rPr>
+                <w:rFonts w:hint="eastAsia"/>
+              </w:rPr>
+              <w:t xml:space="preserve">系统提示注入未实现</w:t>
             </w:r>
           </w:p>
         </w:tc>
@@ -17492,7 +18196,7 @@
               <w:rPr>
                 <w:rFonts w:hint="eastAsia"/>
               </w:rPr>
-              <w:t xml:space="preserve">不知道何时用</w:t>
+              <w:t xml:space="preserve">不知何时用</w:t>
             </w:r>
             <w:r>
               <w:t xml:space="preserve"> akn_search</w:t>
@@ -17512,16 +18216,7 @@
               <w:rPr>
                 <w:rFonts w:hint="eastAsia"/>
               </w:rPr>
-              <w:t xml:space="preserve">内向</w:t>
-            </w:r>
-            <w:r>
-              <w:t xml:space="preserve"> agent preset </w:t>
-            </w:r>
-            <w:r>
-              <w:rPr>
-                <w:rFonts w:hint="eastAsia"/>
-              </w:rPr>
-              <w:t xml:space="preserve">注入使用引导</w:t>
+              <w:t xml:space="preserve">内注入引导</w:t>
             </w:r>
           </w:p>
         </w:tc>
@@ -17533,6 +18228,23 @@
             </w:pPr>
             <w:r>
               <w:t xml:space="preserve">P1</w:t>
+            </w:r>
+          </w:p>
+        </w:tc>
+        <w:tc>
+          <w:tcPr/>
+          <w:p>
+            <w:pPr>
+              <w:pStyle w:val="Compact"/>
+            </w:pPr>
+            <w:r>
+              <w:t xml:space="preserve">⏸ </w:t>
+            </w:r>
+            <w:r>
+              <w:rPr>
+                <w:rFonts w:hint="eastAsia"/>
+              </w:rPr>
+              <w:t xml:space="preserve">待办</w:t>
             </w:r>
           </w:p>
         </w:tc>
@@ -17548,67 +18260,170 @@
           <w:b/>
           <w:bCs/>
         </w:rPr>
+        <w:t xml:space="preserve">修复日志（2026-08-18）</w:t>
+      </w:r>
+      <w:r>
+        <w:rPr>
+          <w:rFonts w:hint="eastAsia"/>
+        </w:rPr>
+        <w:t xml:space="preserve">：P0#1</w:t>
+      </w:r>
+      <w:r>
+        <w:t xml:space="preserve"> </w:t>
+      </w:r>
+      <w:r>
+        <w:rPr>
+          <w:rFonts w:hint="eastAsia"/>
+        </w:rPr>
+        <w:t xml:space="preserve">自证漏洞、P0#2</w:t>
+      </w:r>
+      <w:r>
+        <w:t xml:space="preserve"> </w:t>
+      </w:r>
+      <w:r>
+        <w:rPr>
+          <w:rFonts w:hint="eastAsia"/>
+        </w:rPr>
+        <w:t xml:space="preserve">反向索引、P1#5</w:t>
+      </w:r>
+      <w:r>
+        <w:t xml:space="preserve"> </w:t>
+      </w:r>
+      <w:r>
+        <w:rPr>
+          <w:rFonts w:hint="eastAsia"/>
+        </w:rPr>
+        <w:t xml:space="preserve">配置接线、P1#6</w:t>
+      </w:r>
+      <w:r>
+        <w:t xml:space="preserve"> truncated、P2#8 </w:t>
+      </w:r>
+      <w:r>
+        <w:rPr>
+          <w:rFonts w:hint="eastAsia"/>
+        </w:rPr>
+        <w:t xml:space="preserve">死代码、P2#9</w:t>
+      </w:r>
+      <w:r>
+        <w:t xml:space="preserve"> </w:t>
+      </w:r>
+      <w:r>
+        <w:rPr>
+          <w:rFonts w:hint="eastAsia"/>
+        </w:rPr>
+        <w:t xml:space="preserve">次级排序已修复，并通过新增回归断言；冒烟测试由</w:t>
+      </w:r>
+      <w:r>
+        <w:t xml:space="preserve"> 14 →</w:t>
+      </w:r>
+      <w:r>
+        <w:t xml:space="preserve"> </w:t>
+      </w:r>
+      <w:r>
+        <w:rPr>
+          <w:b/>
+          <w:bCs/>
+        </w:rPr>
+        <w:t xml:space="preserve">20 </w:t>
+      </w:r>
+      <w:r>
+        <w:rPr>
+          <w:rFonts w:hint="eastAsia"/>
+          <w:b/>
+          <w:bCs/>
+        </w:rPr>
+        <w:t xml:space="preserve">项全绿</w:t>
+      </w:r>
+      <w:r>
+        <w:t xml:space="preserve">。P0#3/#4 </w:t>
+      </w:r>
+      <w:r>
+        <w:rPr>
+          <w:rFonts w:hint="eastAsia"/>
+        </w:rPr>
+        <w:t xml:space="preserve">已加固（多别名</w:t>
+      </w:r>
+      <w:r>
+        <w:t xml:space="preserve"> + </w:t>
+      </w:r>
+      <w:r>
+        <w:rPr>
+          <w:rFonts w:hint="eastAsia"/>
+        </w:rPr>
+        <w:t xml:space="preserve">回退日志），待真实</w:t>
+      </w:r>
+      <w:r>
+        <w:t xml:space="preserve"> DSH </w:t>
+      </w:r>
+      <w:r>
+        <w:rPr>
+          <w:rFonts w:hint="eastAsia"/>
+        </w:rPr>
+        <w:t xml:space="preserve">挂载确认事件/运行时结构。剩余待办：Zod</w:t>
+      </w:r>
+      <w:r>
+        <w:t xml:space="preserve"> </w:t>
+      </w:r>
+      <w:r>
+        <w:rPr>
+          <w:rFonts w:hint="eastAsia"/>
+        </w:rPr>
+        <w:t xml:space="preserve">错误包装、观测性</w:t>
+      </w:r>
+      <w:r>
+        <w:t xml:space="preserve"> stats、seed </w:t>
+      </w:r>
+      <w:r>
+        <w:rPr>
+          <w:rFonts w:hint="eastAsia"/>
+        </w:rPr>
+        <w:t xml:space="preserve">文档对齐、单测/CI、系统提示注入。</w:t>
+      </w:r>
+    </w:p>
+    <w:p>
+      <w:pPr>
+        <w:pStyle w:val="BodyText"/>
+      </w:pPr>
+      <w:r>
+        <w:rPr>
+          <w:rFonts w:hint="eastAsia"/>
+          <w:b/>
+          <w:bCs/>
+        </w:rPr>
         <w:t xml:space="preserve">优先级汇总</w:t>
       </w:r>
       <w:r>
         <w:rPr>
           <w:rFonts w:hint="eastAsia"/>
         </w:rPr>
-        <w:t xml:space="preserve">：P0</w:t>
-      </w:r>
-      <w:r>
-        <w:t xml:space="preserve"> </w:t>
-      </w:r>
-      <w:r>
-        <w:rPr>
-          <w:rFonts w:hint="eastAsia"/>
-        </w:rPr>
-        <w:t xml:space="preserve">三项（A</w:t>
-      </w:r>
-      <w:r>
-        <w:t xml:space="preserve"> </w:t>
-      </w:r>
-      <w:r>
-        <w:rPr>
-          <w:rFonts w:hint="eastAsia"/>
-        </w:rPr>
-        <w:t xml:space="preserve">反向索引一致性、B</w:t>
-      </w:r>
-      <w:r>
-        <w:t xml:space="preserve"> </w:t>
-      </w:r>
-      <w:r>
-        <w:rPr>
-          <w:rFonts w:hint="eastAsia"/>
-        </w:rPr>
-        <w:t xml:space="preserve">事件契约、C</w:t>
-      </w:r>
-      <w:r>
-        <w:t xml:space="preserve"> runtime </w:t>
-      </w:r>
-      <w:r>
-        <w:rPr>
-          <w:rFonts w:hint="eastAsia"/>
-        </w:rPr>
-        <w:t xml:space="preserve">探测）是集成前的正确性/风险项；P1</w:t>
-      </w:r>
-      <w:r>
-        <w:t xml:space="preserve"> </w:t>
-      </w:r>
-      <w:r>
-        <w:rPr>
-          <w:rFonts w:hint="eastAsia"/>
-        </w:rPr>
-        <w:t xml:space="preserve">五项（D/E/F/G/J）决定可维护性与可用性；P2</w:t>
-      </w:r>
-      <w:r>
-        <w:t xml:space="preserve"> </w:t>
-      </w:r>
-      <w:r>
-        <w:rPr>
-          <w:rFonts w:hint="eastAsia"/>
-        </w:rPr>
-        <w:t xml:space="preserve">两项为打磨项。</w:t>
+        <w:t xml:space="preserve">：已修复</w:t>
+      </w:r>
+      <w:r>
+        <w:t xml:space="preserve"> 6 </w:t>
+      </w:r>
+      <w:r>
+        <w:rPr>
+          <w:rFonts w:hint="eastAsia"/>
+        </w:rPr>
+        <w:t xml:space="preserve">项、已加固</w:t>
+      </w:r>
+      <w:r>
+        <w:t xml:space="preserve"> 2 </w:t>
+      </w:r>
+      <w:r>
+        <w:rPr>
+          <w:rFonts w:hint="eastAsia"/>
+        </w:rPr>
+        <w:t xml:space="preserve">项、待办</w:t>
+      </w:r>
+      <w:r>
+        <w:t xml:space="preserve"> 7 </w:t>
+      </w:r>
+      <w:r>
+        <w:rPr>
+          <w:rFonts w:hint="eastAsia"/>
+        </w:rPr>
+        <w:t xml:space="preserve">项。</w:t>
       </w:r>
     </w:p>
     <w:bookmarkEnd w:id="67"/>

</xml_diff>